<commit_message>
Pedidos de acesso e tela Equipe; ajustes pedidos pela diretoria
- login: 'Solicitar acesso' (nome, e-mail, área e senha criada pela própria pessoa);
  perfil nasce inativo e a diretoria recebe aviso no sininho (migração 0013)
- Equipe (só diretoria): liberar acesso escolhendo o perfil, mudar perfil, tirar acesso;
  ninguém pede perfil de diretoria e a diretoria não remove o próprio acesso
- contrato: sai a frase 'Descrever neste campo…' da cláusula XII
- Painel: sem o indicador Em atraso
- Mapa: matriz na Rua Nossa Senhora de Fátima, 166 (Nova Paulínia) e showroom kaza+ na
  Rua Arthur de Freitas Leitão, 841 (Nova Campinas), com endereço no marcador

Co-Authored-By: Claude Opus 5.5 <noreply@anthropic.com>
Claude-Session: https://claude.ai/code/session_01H16c8LZ5QM8fY2LubRcu5J
</commit_message>
<xml_diff>
--- a/public/modelos/contrato-bra.docx
+++ b/public/modelos/contrato-bra.docx
@@ -2232,24 +2232,6 @@
           <w:szCs w:val="25"/>
         </w:rPr>
         <w:t>XII. DO ESCOPO CONTRATADO</w:t>
-      </w:r>
-    </w:p>
-    <w:p>
-      <w:pPr>
-        <w:spacing w:after="160" w:line="276" w:lineRule="auto"/>
-        <w:jc w:val="both"/>
-      </w:pPr>
-      <w:r>
-        <w:t>Descrever neste campo, de forma detalhada, todos os itens, quantidades e especificações técnicas negociados com a CLIENTE (automação, circuitos, sonorização, cabeamento, rede, antenas e demais equipamentos), conforme proposta anexa.</w:t>
-      </w:r>
-      <w:r>
-        <w:rPr>
-          <w:b/>
-          <w:bCs/>
-          <w:i/>
-          <w:iCs/>
-          <w:color w:val="B8912F"/>
-        </w:rPr>
       </w:r>
     </w:p>
     <w:p>

</xml_diff>